<commit_message>
Finished embedded systems lab 6
</commit_message>
<xml_diff>
--- a/Fall-2026/embedded-systems/labs/Lab6/Lab6/Lab6.docx
+++ b/Fall-2026/embedded-systems/labs/Lab6/Lab6/Lab6.docx
@@ -3,6 +3,93 @@
 <w:document xmlns:wpc="http://schemas.microsoft.com/office/word/2010/wordprocessingCanvas" xmlns:cx="http://schemas.microsoft.com/office/drawing/2014/chartex" xmlns:cx1="http://schemas.microsoft.com/office/drawing/2015/9/8/chartex" xmlns:cx2="http://schemas.microsoft.com/office/drawing/2015/10/21/chartex" xmlns:cx3="http://schemas.microsoft.com/office/drawing/2016/5/9/chartex" xmlns:cx4="http://schemas.microsoft.com/office/drawing/2016/5/10/chartex" xmlns:cx5="http://schemas.microsoft.com/office/drawing/2016/5/11/chartex" xmlns:cx6="http://schemas.microsoft.com/office/drawing/2016/5/12/chartex" xmlns:cx7="http://schemas.microsoft.com/office/drawing/2016/5/13/chartex" xmlns:cx8="http://schemas.microsoft.com/office/drawing/2016/5/14/chartex" xmlns:mc="http://schemas.openxmlformats.org/markup-compatibility/2006" xmlns:aink="http://schemas.microsoft.com/office/drawing/2016/ink" xmlns:am3d="http://schemas.microsoft.com/office/drawing/2017/model3d" xmlns:o="urn:schemas-microsoft-com:office:office" xmlns:oel="http://schemas.microsoft.com/office/2019/extlst" xmlns:r="http://schemas.openxmlformats.org/officeDocument/2006/relationships" xmlns:m="http://schemas.openxmlformats.org/officeDocument/2006/math" xmlns:v="urn:schemas-microsoft-com:vml" xmlns:wp14="http://schemas.microsoft.com/office/word/2010/wordprocessingDrawing" xmlns:wp="http://schemas.openxmlformats.org/drawingml/2006/wordprocessingDrawing" xmlns:w10="urn:schemas-microsoft-com:office:word" xmlns:w="http://schemas.openxmlformats.org/wordprocessingml/2006/main" xmlns:w14="http://schemas.microsoft.com/office/word/2010/wordml" xmlns:w15="http://schemas.microsoft.com/office/word/2012/wordml" xmlns:w16cex="http://schemas.microsoft.com/office/word/2018/wordml/cex" xmlns:w16cid="http://schemas.microsoft.com/office/word/2016/wordml/cid" xmlns:w16="http://schemas.microsoft.com/office/word/2018/wordml" xmlns:w16du="http://schemas.microsoft.com/office/word/2023/wordml/word16du" xmlns:w16sdtdh="http://schemas.microsoft.com/office/word/2020/wordml/sdtdatahash" xmlns:w16sdtfl="http://schemas.microsoft.com/office/word/2024/wordml/sdtformatlock" xmlns:w16se="http://schemas.microsoft.com/office/word/2015/wordml/symex" xmlns:wpg="http://schemas.microsoft.com/office/word/2010/wordprocessingGroup" xmlns:wpi="http://schemas.microsoft.com/office/word/2010/wordprocessingInk" xmlns:wne="http://schemas.microsoft.com/office/word/2006/wordml" xmlns:wps="http://schemas.microsoft.com/office/word/2010/wordprocessingShape" mc:Ignorable="w14 w15 w16se w16cid w16 w16cex w16sdtdh w16sdtfl w16du wp14">
   <w:body>
     <w:p>
+      <w:r>
+        <w:t>Josiah Schmitz</w:t>
+      </w:r>
+    </w:p>
+    <w:p>
+      <w:r>
+        <w:t>Embedded Systems</w:t>
+      </w:r>
+    </w:p>
+    <w:p>
+      <w:pPr>
+        <w:jc w:val="center"/>
+        <w:rPr>
+          <w:u w:val="single"/>
+        </w:rPr>
+      </w:pPr>
+      <w:r>
+        <w:rPr>
+          <w:u w:val="single"/>
+        </w:rPr>
+        <w:t>Lab 6: GPIO and ADC</w:t>
+      </w:r>
+    </w:p>
+    <w:p>
+      <w:pPr>
+        <w:rPr>
+          <w:b/>
+          <w:bCs/>
+        </w:rPr>
+      </w:pPr>
+    </w:p>
+    <w:p>
+      <w:pPr>
+        <w:ind w:firstLine="720"/>
+        <w:rPr>
+          <w:b/>
+          <w:bCs/>
+        </w:rPr>
+      </w:pPr>
+      <w:r>
+        <w:rPr>
+          <w:b/>
+          <w:bCs/>
+        </w:rPr>
+        <w:t>Experiment B Output</w:t>
+      </w:r>
+      <w:r>
+        <w:rPr>
+          <w:b/>
+          <w:bCs/>
+        </w:rPr>
+        <w:tab/>
+      </w:r>
+      <w:r>
+        <w:rPr>
+          <w:b/>
+          <w:bCs/>
+        </w:rPr>
+        <w:tab/>
+      </w:r>
+      <w:r>
+        <w:rPr>
+          <w:b/>
+          <w:bCs/>
+        </w:rPr>
+        <w:tab/>
+      </w:r>
+      <w:r>
+        <w:rPr>
+          <w:b/>
+          <w:bCs/>
+        </w:rPr>
+        <w:tab/>
+      </w:r>
+      <w:r>
+        <w:rPr>
+          <w:b/>
+          <w:bCs/>
+        </w:rPr>
+        <w:tab/>
+        <w:t>Experiment C Output</w:t>
+      </w:r>
+    </w:p>
+    <w:p>
+      <w:pPr>
+        <w:ind w:firstLine="720"/>
+      </w:pPr>
       <w:r>
         <w:rPr>
           <w:noProof/>
@@ -23,7 +110,7 @@
                     <pic:cNvPicPr/>
                   </pic:nvPicPr>
                   <pic:blipFill>
-                    <a:blip r:embed="rId4"/>
+                    <a:blip r:embed="rId7"/>
                     <a:stretch>
                       <a:fillRect/>
                     </a:stretch>
@@ -44,9 +131,22 @@
         </w:drawing>
       </w:r>
       <w:r>
-        <w:t xml:space="preserve">      </w:t>
-      </w:r>
-      <w:r>
+        <w:tab/>
+      </w:r>
+      <w:r>
+        <w:tab/>
+      </w:r>
+      <w:r>
+        <w:tab/>
+      </w:r>
+      <w:r>
+        <w:tab/>
+        <w:t xml:space="preserve">        </w:t>
+      </w:r>
+      <w:r>
+        <w:rPr>
+          <w:noProof/>
+        </w:rPr>
         <w:drawing>
           <wp:inline distT="0" distB="0" distL="0" distR="0" wp14:anchorId="07ECC316" wp14:editId="2104E921">
             <wp:extent cx="1744980" cy="2737371"/>
@@ -63,7 +163,7 @@
                     <pic:cNvPicPr/>
                   </pic:nvPicPr>
                   <pic:blipFill rotWithShape="1">
-                    <a:blip r:embed="rId5"/>
+                    <a:blip r:embed="rId8"/>
                     <a:srcRect l="22727" t="81414" r="73182"/>
                     <a:stretch>
                       <a:fillRect/>
@@ -94,6 +194,385 @@
       </w:r>
     </w:p>
     <w:p/>
+    <w:p/>
+    <w:p/>
+    <w:p/>
+    <w:p/>
+    <w:p/>
+    <w:p>
+      <w:r>
+        <w:lastRenderedPageBreak/>
+        <w:t>Experiment A:</w:t>
+      </w:r>
+      <w:r>
+        <w:tab/>
+      </w:r>
+      <w:r>
+        <w:tab/>
+      </w:r>
+      <w:r>
+        <w:tab/>
+      </w:r>
+      <w:r>
+        <w:tab/>
+      </w:r>
+      <w:r>
+        <w:rPr>
+          <w:noProof/>
+        </w:rPr>
+        <w:drawing>
+          <wp:inline distT="0" distB="0" distL="0" distR="0" wp14:anchorId="04467F8F" wp14:editId="00527ED4">
+            <wp:extent cx="2947660" cy="2209800"/>
+            <wp:effectExtent l="0" t="0" r="5715" b="0"/>
+            <wp:docPr id="2060908742" name="Picture 1"/>
+            <wp:cNvGraphicFramePr>
+              <a:graphicFrameLocks xmlns:a="http://schemas.openxmlformats.org/drawingml/2006/main" noChangeAspect="1"/>
+            </wp:cNvGraphicFramePr>
+            <a:graphic xmlns:a="http://schemas.openxmlformats.org/drawingml/2006/main">
+              <a:graphicData uri="http://schemas.openxmlformats.org/drawingml/2006/picture">
+                <pic:pic xmlns:pic="http://schemas.openxmlformats.org/drawingml/2006/picture">
+                  <pic:nvPicPr>
+                    <pic:cNvPr id="0" name="Picture 1"/>
+                    <pic:cNvPicPr>
+                      <a:picLocks noChangeAspect="1" noChangeArrowheads="1"/>
+                    </pic:cNvPicPr>
+                  </pic:nvPicPr>
+                  <pic:blipFill>
+                    <a:blip r:embed="rId9" cstate="print">
+                      <a:extLst>
+                        <a:ext uri="{28A0092B-C50C-407E-A947-70E740481C1C}">
+                          <a14:useLocalDpi xmlns:a14="http://schemas.microsoft.com/office/drawing/2010/main" val="0"/>
+                        </a:ext>
+                      </a:extLst>
+                    </a:blip>
+                    <a:srcRect/>
+                    <a:stretch>
+                      <a:fillRect/>
+                    </a:stretch>
+                  </pic:blipFill>
+                  <pic:spPr bwMode="auto">
+                    <a:xfrm>
+                      <a:off x="0" y="0"/>
+                      <a:ext cx="2951584" cy="2212742"/>
+                    </a:xfrm>
+                    <a:prstGeom prst="rect">
+                      <a:avLst/>
+                    </a:prstGeom>
+                    <a:noFill/>
+                    <a:ln>
+                      <a:noFill/>
+                    </a:ln>
+                  </pic:spPr>
+                </pic:pic>
+              </a:graphicData>
+            </a:graphic>
+          </wp:inline>
+        </w:drawing>
+      </w:r>
+      <w:r>
+        <w:tab/>
+        <w:t xml:space="preserve"> </w:t>
+      </w:r>
+    </w:p>
+    <w:p>
+      <w:r>
+        <w:t>Experiment B:</w:t>
+      </w:r>
+      <w:r>
+        <w:tab/>
+      </w:r>
+      <w:r>
+        <w:tab/>
+      </w:r>
+      <w:r>
+        <w:tab/>
+      </w:r>
+      <w:r>
+        <w:tab/>
+        <w:t xml:space="preserve"> </w:t>
+      </w:r>
+      <w:r>
+        <w:rPr>
+          <w:noProof/>
+        </w:rPr>
+        <w:drawing>
+          <wp:inline distT="0" distB="0" distL="0" distR="0" wp14:anchorId="2A9AB4C3" wp14:editId="2CC44331">
+            <wp:extent cx="2910840" cy="2182197"/>
+            <wp:effectExtent l="0" t="0" r="3810" b="8890"/>
+            <wp:docPr id="520945592" name="Picture 3"/>
+            <wp:cNvGraphicFramePr>
+              <a:graphicFrameLocks xmlns:a="http://schemas.openxmlformats.org/drawingml/2006/main" noChangeAspect="1"/>
+            </wp:cNvGraphicFramePr>
+            <a:graphic xmlns:a="http://schemas.openxmlformats.org/drawingml/2006/main">
+              <a:graphicData uri="http://schemas.openxmlformats.org/drawingml/2006/picture">
+                <pic:pic xmlns:pic="http://schemas.openxmlformats.org/drawingml/2006/picture">
+                  <pic:nvPicPr>
+                    <pic:cNvPr id="0" name="Picture 3"/>
+                    <pic:cNvPicPr>
+                      <a:picLocks noChangeAspect="1" noChangeArrowheads="1"/>
+                    </pic:cNvPicPr>
+                  </pic:nvPicPr>
+                  <pic:blipFill>
+                    <a:blip r:embed="rId10" cstate="print">
+                      <a:extLst>
+                        <a:ext uri="{28A0092B-C50C-407E-A947-70E740481C1C}">
+                          <a14:useLocalDpi xmlns:a14="http://schemas.microsoft.com/office/drawing/2010/main" val="0"/>
+                        </a:ext>
+                      </a:extLst>
+                    </a:blip>
+                    <a:srcRect/>
+                    <a:stretch>
+                      <a:fillRect/>
+                    </a:stretch>
+                  </pic:blipFill>
+                  <pic:spPr bwMode="auto">
+                    <a:xfrm>
+                      <a:off x="0" y="0"/>
+                      <a:ext cx="2915257" cy="2185509"/>
+                    </a:xfrm>
+                    <a:prstGeom prst="rect">
+                      <a:avLst/>
+                    </a:prstGeom>
+                    <a:noFill/>
+                    <a:ln>
+                      <a:noFill/>
+                    </a:ln>
+                  </pic:spPr>
+                </pic:pic>
+              </a:graphicData>
+            </a:graphic>
+          </wp:inline>
+        </w:drawing>
+      </w:r>
+    </w:p>
+    <w:p>
+      <w:r>
+        <w:t xml:space="preserve">Experiment C: </w:t>
+      </w:r>
+      <w:r>
+        <w:tab/>
+      </w:r>
+      <w:r>
+        <w:tab/>
+      </w:r>
+      <w:r>
+        <w:tab/>
+      </w:r>
+      <w:r>
+        <w:rPr>
+          <w:noProof/>
+        </w:rPr>
+        <w:drawing>
+          <wp:inline distT="0" distB="0" distL="0" distR="0" wp14:anchorId="7377ED19" wp14:editId="0AF9D099">
+            <wp:extent cx="3059468" cy="2293620"/>
+            <wp:effectExtent l="0" t="0" r="7620" b="0"/>
+            <wp:docPr id="281084356" name="Picture 2"/>
+            <wp:cNvGraphicFramePr>
+              <a:graphicFrameLocks xmlns:a="http://schemas.openxmlformats.org/drawingml/2006/main" noChangeAspect="1"/>
+            </wp:cNvGraphicFramePr>
+            <a:graphic xmlns:a="http://schemas.openxmlformats.org/drawingml/2006/main">
+              <a:graphicData uri="http://schemas.openxmlformats.org/drawingml/2006/picture">
+                <pic:pic xmlns:pic="http://schemas.openxmlformats.org/drawingml/2006/picture">
+                  <pic:nvPicPr>
+                    <pic:cNvPr id="0" name="Picture 2"/>
+                    <pic:cNvPicPr>
+                      <a:picLocks noChangeAspect="1" noChangeArrowheads="1"/>
+                    </pic:cNvPicPr>
+                  </pic:nvPicPr>
+                  <pic:blipFill>
+                    <a:blip r:embed="rId11" cstate="print">
+                      <a:extLst>
+                        <a:ext uri="{28A0092B-C50C-407E-A947-70E740481C1C}">
+                          <a14:useLocalDpi xmlns:a14="http://schemas.microsoft.com/office/drawing/2010/main" val="0"/>
+                        </a:ext>
+                      </a:extLst>
+                    </a:blip>
+                    <a:srcRect/>
+                    <a:stretch>
+                      <a:fillRect/>
+                    </a:stretch>
+                  </pic:blipFill>
+                  <pic:spPr bwMode="auto">
+                    <a:xfrm>
+                      <a:off x="0" y="0"/>
+                      <a:ext cx="3062774" cy="2296098"/>
+                    </a:xfrm>
+                    <a:prstGeom prst="rect">
+                      <a:avLst/>
+                    </a:prstGeom>
+                    <a:noFill/>
+                    <a:ln>
+                      <a:noFill/>
+                    </a:ln>
+                  </pic:spPr>
+                </pic:pic>
+              </a:graphicData>
+            </a:graphic>
+          </wp:inline>
+        </w:drawing>
+      </w:r>
+    </w:p>
+    <w:p/>
+    <w:p/>
+    <w:p/>
+    <w:p>
+      <w:pPr>
+        <w:rPr>
+          <w:b/>
+          <w:bCs/>
+        </w:rPr>
+      </w:pPr>
+      <w:r>
+        <w:rPr>
+          <w:b/>
+          <w:bCs/>
+        </w:rPr>
+        <w:lastRenderedPageBreak/>
+        <w:t>Observations</w:t>
+      </w:r>
+    </w:p>
+    <w:p>
+      <w:r>
+        <w:rPr>
+          <w:u w:val="single"/>
+        </w:rPr>
+        <w:t>Experiment A:</w:t>
+      </w:r>
+      <w:r>
+        <w:t xml:space="preserve"> The LED turned off for a half second, then turned on for a half second in a continuous loop. The serial monitor looped between displaying “LED ON” and “LED OFF”</w:t>
+      </w:r>
+    </w:p>
+    <w:p>
+      <w:r>
+        <w:rPr>
+          <w:u w:val="single"/>
+        </w:rPr>
+        <w:t>Experiment B:</w:t>
+      </w:r>
+      <w:r>
+        <w:t xml:space="preserve"> The LED turned on when the sensor was covered and turned off when the sensor was uncovered. D0 was 0 when the LED was turned on, and D0 was 1 when the LED was turned off.</w:t>
+      </w:r>
+    </w:p>
+    <w:p>
+      <w:r>
+        <w:rPr>
+          <w:u w:val="single"/>
+        </w:rPr>
+        <w:t>Experiment C:</w:t>
+      </w:r>
+      <w:r>
+        <w:t xml:space="preserve"> The smallest threshold was 0, and the largest threshold was 4095 (as seen above). I left the threshold set to the original 2000, so the LED turned on </w:t>
+      </w:r>
+      <w:r>
+        <w:t xml:space="preserve">only </w:t>
+      </w:r>
+      <w:r>
+        <w:t xml:space="preserve">when the </w:t>
+      </w:r>
+      <w:r>
+        <w:t>ADC value was greater than 2000.</w:t>
+      </w:r>
+    </w:p>
+    <w:p>
+      <w:pPr>
+        <w:rPr>
+          <w:b/>
+          <w:bCs/>
+        </w:rPr>
+      </w:pPr>
+      <w:r>
+        <w:rPr>
+          <w:b/>
+          <w:bCs/>
+        </w:rPr>
+        <w:t>Critical Thinking Questions:</w:t>
+      </w:r>
+    </w:p>
+    <w:p>
+      <w:pPr>
+        <w:pStyle w:val="ListParagraph"/>
+        <w:numPr>
+          <w:ilvl w:val="0"/>
+          <w:numId w:val="1"/>
+        </w:numPr>
+      </w:pPr>
+      <w:r>
+        <w:t>I had to deal with the ESP32 not sitting snugly in the board, causing the pin connections to randomly become loose and disconnect when I was trying to get readings. I also noticed a small delay between when the LDR sensor was covered and the LED turning on. This never happened when using Wokwi.</w:t>
+      </w:r>
+    </w:p>
+    <w:p>
+      <w:pPr>
+        <w:pStyle w:val="ListParagraph"/>
+        <w:numPr>
+          <w:ilvl w:val="0"/>
+          <w:numId w:val="1"/>
+        </w:numPr>
+      </w:pPr>
+      <w:r>
+        <w:t>The system will reset because it’s worried that lack of free CPU time means it’s frozen. Watchdog Timer is what reacts to a delay-less loop.</w:t>
+      </w:r>
+    </w:p>
+    <w:p>
+      <w:pPr>
+        <w:pStyle w:val="ListParagraph"/>
+        <w:numPr>
+          <w:ilvl w:val="0"/>
+          <w:numId w:val="1"/>
+        </w:numPr>
+      </w:pPr>
+      <w:r>
+        <w:t xml:space="preserve"> The LDR uses digital input while the potentiometer uses analog input. Digital input simply provides a 0 or 1 to the system while analog input provides a predetermined range of values. The potentiometer controls how sensitive the sensor is to light.</w:t>
+      </w:r>
+    </w:p>
+    <w:p>
+      <w:pPr>
+        <w:pStyle w:val="ListParagraph"/>
+        <w:numPr>
+          <w:ilvl w:val="0"/>
+          <w:numId w:val="1"/>
+        </w:numPr>
+      </w:pPr>
+      <w:r>
+        <w:t>Because 4095 represents the maximum voltage of 3.3V provided by the ESP32. A reading of 2048 is essentially the halfway point of that maximum voltage.</w:t>
+      </w:r>
+    </w:p>
+    <w:p>
+      <w:pPr>
+        <w:pStyle w:val="ListParagraph"/>
+        <w:numPr>
+          <w:ilvl w:val="0"/>
+          <w:numId w:val="1"/>
+        </w:numPr>
+      </w:pPr>
+      <w:r>
+        <w:t>Any input marked as ADC on the ESP32 PINOUT chart, such as GPIO34, GPIO39, or GPIO36. Because the LED is an output, and the sensor is an input.</w:t>
+      </w:r>
+    </w:p>
+    <w:p>
+      <w:pPr>
+        <w:pStyle w:val="ListParagraph"/>
+        <w:numPr>
+          <w:ilvl w:val="0"/>
+          <w:numId w:val="1"/>
+        </w:numPr>
+      </w:pPr>
+      <w:r>
+        <w:lastRenderedPageBreak/>
+        <w:t>Download mode is needed so the system knows it is supposed to be receiving a new program from the computer.</w:t>
+      </w:r>
+    </w:p>
+    <w:p>
+      <w:pPr>
+        <w:pStyle w:val="ListParagraph"/>
+        <w:numPr>
+          <w:ilvl w:val="0"/>
+          <w:numId w:val="1"/>
+        </w:numPr>
+      </w:pPr>
+      <w:r>
+        <w:t>I simply used the default threshold, which seemed to work well. If the threshold were set close to the normal reading, the light would constantly fluctuate between on and off.</w:t>
+      </w:r>
+    </w:p>
     <w:sectPr>
       <w:pgSz w:w="12240" w:h="15840"/>
       <w:pgMar w:top="1440" w:right="1440" w:bottom="1440" w:left="1440" w:header="720" w:footer="720" w:gutter="0"/>
@@ -102,6 +581,153 @@
     </w:sectPr>
   </w:body>
 </w:document>
+</file>
+
+<file path=word/endnotes.xml><?xml version="1.0" encoding="utf-8"?>
+<w:endnotes xmlns:wpc="http://schemas.microsoft.com/office/word/2010/wordprocessingCanvas" xmlns:cx="http://schemas.microsoft.com/office/drawing/2014/chartex" xmlns:cx1="http://schemas.microsoft.com/office/drawing/2015/9/8/chartex" xmlns:cx2="http://schemas.microsoft.com/office/drawing/2015/10/21/chartex" xmlns:cx3="http://schemas.microsoft.com/office/drawing/2016/5/9/chartex" xmlns:cx4="http://schemas.microsoft.com/office/drawing/2016/5/10/chartex" xmlns:cx5="http://schemas.microsoft.com/office/drawing/2016/5/11/chartex" xmlns:cx6="http://schemas.microsoft.com/office/drawing/2016/5/12/chartex" xmlns:cx7="http://schemas.microsoft.com/office/drawing/2016/5/13/chartex" xmlns:cx8="http://schemas.microsoft.com/office/drawing/2016/5/14/chartex" xmlns:mc="http://schemas.openxmlformats.org/markup-compatibility/2006" xmlns:aink="http://schemas.microsoft.com/office/drawing/2016/ink" xmlns:am3d="http://schemas.microsoft.com/office/drawing/2017/model3d" xmlns:o="urn:schemas-microsoft-com:office:office" xmlns:oel="http://schemas.microsoft.com/office/2019/extlst" xmlns:r="http://schemas.openxmlformats.org/officeDocument/2006/relationships" xmlns:m="http://schemas.openxmlformats.org/officeDocument/2006/math" xmlns:v="urn:schemas-microsoft-com:vml" xmlns:wp14="http://schemas.microsoft.com/office/word/2010/wordprocessingDrawing" xmlns:wp="http://schemas.openxmlformats.org/drawingml/2006/wordprocessingDrawing" xmlns:w10="urn:schemas-microsoft-com:office:word" xmlns:w="http://schemas.openxmlformats.org/wordprocessingml/2006/main" xmlns:w14="http://schemas.microsoft.com/office/word/2010/wordml" xmlns:w15="http://schemas.microsoft.com/office/word/2012/wordml" xmlns:w16cex="http://schemas.microsoft.com/office/word/2018/wordml/cex" xmlns:w16cid="http://schemas.microsoft.com/office/word/2016/wordml/cid" xmlns:w16="http://schemas.microsoft.com/office/word/2018/wordml" xmlns:w16du="http://schemas.microsoft.com/office/word/2023/wordml/word16du" xmlns:w16sdtdh="http://schemas.microsoft.com/office/word/2020/wordml/sdtdatahash" xmlns:w16sdtfl="http://schemas.microsoft.com/office/word/2024/wordml/sdtformatlock" xmlns:w16se="http://schemas.microsoft.com/office/word/2015/wordml/symex" xmlns:wpg="http://schemas.microsoft.com/office/word/2010/wordprocessingGroup" xmlns:wpi="http://schemas.microsoft.com/office/word/2010/wordprocessingInk" xmlns:wne="http://schemas.microsoft.com/office/word/2006/wordml" xmlns:wps="http://schemas.microsoft.com/office/word/2010/wordprocessingShape" mc:Ignorable="w14 w15 w16se w16cid w16 w16cex w16sdtdh w16sdtfl w16du wp14">
+  <w:endnote w:type="separator" w:id="-1">
+    <w:p>
+      <w:pPr>
+        <w:spacing w:line="240" w:lineRule="auto"/>
+      </w:pPr>
+      <w:r>
+        <w:separator/>
+      </w:r>
+    </w:p>
+  </w:endnote>
+  <w:endnote w:type="continuationSeparator" w:id="0">
+    <w:p>
+      <w:pPr>
+        <w:spacing w:line="240" w:lineRule="auto"/>
+      </w:pPr>
+      <w:r>
+        <w:continuationSeparator/>
+      </w:r>
+    </w:p>
+  </w:endnote>
+</w:endnotes>
+</file>
+
+<file path=word/footnotes.xml><?xml version="1.0" encoding="utf-8"?>
+<w:footnotes xmlns:wpc="http://schemas.microsoft.com/office/word/2010/wordprocessingCanvas" xmlns:cx="http://schemas.microsoft.com/office/drawing/2014/chartex" xmlns:cx1="http://schemas.microsoft.com/office/drawing/2015/9/8/chartex" xmlns:cx2="http://schemas.microsoft.com/office/drawing/2015/10/21/chartex" xmlns:cx3="http://schemas.microsoft.com/office/drawing/2016/5/9/chartex" xmlns:cx4="http://schemas.microsoft.com/office/drawing/2016/5/10/chartex" xmlns:cx5="http://schemas.microsoft.com/office/drawing/2016/5/11/chartex" xmlns:cx6="http://schemas.microsoft.com/office/drawing/2016/5/12/chartex" xmlns:cx7="http://schemas.microsoft.com/office/drawing/2016/5/13/chartex" xmlns:cx8="http://schemas.microsoft.com/office/drawing/2016/5/14/chartex" xmlns:mc="http://schemas.openxmlformats.org/markup-compatibility/2006" xmlns:aink="http://schemas.microsoft.com/office/drawing/2016/ink" xmlns:am3d="http://schemas.microsoft.com/office/drawing/2017/model3d" xmlns:o="urn:schemas-microsoft-com:office:office" xmlns:oel="http://schemas.microsoft.com/office/2019/extlst" xmlns:r="http://schemas.openxmlformats.org/officeDocument/2006/relationships" xmlns:m="http://schemas.openxmlformats.org/officeDocument/2006/math" xmlns:v="urn:schemas-microsoft-com:vml" xmlns:wp14="http://schemas.microsoft.com/office/word/2010/wordprocessingDrawing" xmlns:wp="http://schemas.openxmlformats.org/drawingml/2006/wordprocessingDrawing" xmlns:w10="urn:schemas-microsoft-com:office:word" xmlns:w="http://schemas.openxmlformats.org/wordprocessingml/2006/main" xmlns:w14="http://schemas.microsoft.com/office/word/2010/wordml" xmlns:w15="http://schemas.microsoft.com/office/word/2012/wordml" xmlns:w16cex="http://schemas.microsoft.com/office/word/2018/wordml/cex" xmlns:w16cid="http://schemas.microsoft.com/office/word/2016/wordml/cid" xmlns:w16="http://schemas.microsoft.com/office/word/2018/wordml" xmlns:w16du="http://schemas.microsoft.com/office/word/2023/wordml/word16du" xmlns:w16sdtdh="http://schemas.microsoft.com/office/word/2020/wordml/sdtdatahash" xmlns:w16sdtfl="http://schemas.microsoft.com/office/word/2024/wordml/sdtformatlock" xmlns:w16se="http://schemas.microsoft.com/office/word/2015/wordml/symex" xmlns:wpg="http://schemas.microsoft.com/office/word/2010/wordprocessingGroup" xmlns:wpi="http://schemas.microsoft.com/office/word/2010/wordprocessingInk" xmlns:wne="http://schemas.microsoft.com/office/word/2006/wordml" xmlns:wps="http://schemas.microsoft.com/office/word/2010/wordprocessingShape" mc:Ignorable="w14 w15 w16se w16cid w16 w16cex w16sdtdh w16sdtfl w16du wp14">
+  <w:footnote w:type="separator" w:id="-1">
+    <w:p>
+      <w:pPr>
+        <w:spacing w:line="240" w:lineRule="auto"/>
+      </w:pPr>
+      <w:r>
+        <w:separator/>
+      </w:r>
+    </w:p>
+  </w:footnote>
+  <w:footnote w:type="continuationSeparator" w:id="0">
+    <w:p>
+      <w:pPr>
+        <w:spacing w:line="240" w:lineRule="auto"/>
+      </w:pPr>
+      <w:r>
+        <w:continuationSeparator/>
+      </w:r>
+    </w:p>
+  </w:footnote>
+</w:footnotes>
+</file>
+
+<file path=word/numbering.xml><?xml version="1.0" encoding="utf-8"?>
+<w:numbering xmlns:wpc="http://schemas.microsoft.com/office/word/2010/wordprocessingCanvas" xmlns:cx="http://schemas.microsoft.com/office/drawing/2014/chartex" xmlns:cx1="http://schemas.microsoft.com/office/drawing/2015/9/8/chartex" xmlns:cx2="http://schemas.microsoft.com/office/drawing/2015/10/21/chartex" xmlns:cx3="http://schemas.microsoft.com/office/drawing/2016/5/9/chartex" xmlns:cx4="http://schemas.microsoft.com/office/drawing/2016/5/10/chartex" xmlns:cx5="http://schemas.microsoft.com/office/drawing/2016/5/11/chartex" xmlns:cx6="http://schemas.microsoft.com/office/drawing/2016/5/12/chartex" xmlns:cx7="http://schemas.microsoft.com/office/drawing/2016/5/13/chartex" xmlns:cx8="http://schemas.microsoft.com/office/drawing/2016/5/14/chartex" xmlns:mc="http://schemas.openxmlformats.org/markup-compatibility/2006" xmlns:aink="http://schemas.microsoft.com/office/drawing/2016/ink" xmlns:am3d="http://schemas.microsoft.com/office/drawing/2017/model3d" xmlns:o="urn:schemas-microsoft-com:office:office" xmlns:oel="http://schemas.microsoft.com/office/2019/extlst" xmlns:r="http://schemas.openxmlformats.org/officeDocument/2006/relationships" xmlns:m="http://schemas.openxmlformats.org/officeDocument/2006/math" xmlns:v="urn:schemas-microsoft-com:vml" xmlns:wp14="http://schemas.microsoft.com/office/word/2010/wordprocessingDrawing" xmlns:wp="http://schemas.openxmlformats.org/drawingml/2006/wordprocessingDrawing" xmlns:w10="urn:schemas-microsoft-com:office:word" xmlns:w="http://schemas.openxmlformats.org/wordprocessingml/2006/main" xmlns:w14="http://schemas.microsoft.com/office/word/2010/wordml" xmlns:w15="http://schemas.microsoft.com/office/word/2012/wordml" xmlns:w16cex="http://schemas.microsoft.com/office/word/2018/wordml/cex" xmlns:w16cid="http://schemas.microsoft.com/office/word/2016/wordml/cid" xmlns:w16="http://schemas.microsoft.com/office/word/2018/wordml" xmlns:w16du="http://schemas.microsoft.com/office/word/2023/wordml/word16du" xmlns:w16sdtdh="http://schemas.microsoft.com/office/word/2020/wordml/sdtdatahash" xmlns:w16sdtfl="http://schemas.microsoft.com/office/word/2024/wordml/sdtformatlock" xmlns:w16se="http://schemas.microsoft.com/office/word/2015/wordml/symex" xmlns:wpg="http://schemas.microsoft.com/office/word/2010/wordprocessingGroup" xmlns:wpi="http://schemas.microsoft.com/office/word/2010/wordprocessingInk" xmlns:wne="http://schemas.microsoft.com/office/word/2006/wordml" xmlns:wps="http://schemas.microsoft.com/office/word/2010/wordprocessingShape" mc:Ignorable="w14 w15 w16se w16cid w16 w16cex w16sdtdh w16sdtfl w16du wp14">
+  <w:abstractNum w:abstractNumId="0" w15:restartNumberingAfterBreak="0">
+    <w:nsid w:val="05720FB6"/>
+    <w:multiLevelType w:val="hybridMultilevel"/>
+    <w:tmpl w:val="92BE14CA"/>
+    <w:lvl w:ilvl="0" w:tplc="0409000F">
+      <w:start w:val="1"/>
+      <w:numFmt w:val="decimal"/>
+      <w:lvlText w:val="%1."/>
+      <w:lvlJc w:val="left"/>
+      <w:pPr>
+        <w:ind w:left="720" w:hanging="360"/>
+      </w:pPr>
+      <w:rPr>
+        <w:rFonts w:hint="default"/>
+      </w:rPr>
+    </w:lvl>
+    <w:lvl w:ilvl="1" w:tplc="04090019" w:tentative="1">
+      <w:start w:val="1"/>
+      <w:numFmt w:val="lowerLetter"/>
+      <w:lvlText w:val="%2."/>
+      <w:lvlJc w:val="left"/>
+      <w:pPr>
+        <w:ind w:left="1440" w:hanging="360"/>
+      </w:pPr>
+    </w:lvl>
+    <w:lvl w:ilvl="2" w:tplc="0409001B" w:tentative="1">
+      <w:start w:val="1"/>
+      <w:numFmt w:val="lowerRoman"/>
+      <w:lvlText w:val="%3."/>
+      <w:lvlJc w:val="right"/>
+      <w:pPr>
+        <w:ind w:left="2160" w:hanging="180"/>
+      </w:pPr>
+    </w:lvl>
+    <w:lvl w:ilvl="3" w:tplc="0409000F" w:tentative="1">
+      <w:start w:val="1"/>
+      <w:numFmt w:val="decimal"/>
+      <w:lvlText w:val="%4."/>
+      <w:lvlJc w:val="left"/>
+      <w:pPr>
+        <w:ind w:left="2880" w:hanging="360"/>
+      </w:pPr>
+    </w:lvl>
+    <w:lvl w:ilvl="4" w:tplc="04090019" w:tentative="1">
+      <w:start w:val="1"/>
+      <w:numFmt w:val="lowerLetter"/>
+      <w:lvlText w:val="%5."/>
+      <w:lvlJc w:val="left"/>
+      <w:pPr>
+        <w:ind w:left="3600" w:hanging="360"/>
+      </w:pPr>
+    </w:lvl>
+    <w:lvl w:ilvl="5" w:tplc="0409001B" w:tentative="1">
+      <w:start w:val="1"/>
+      <w:numFmt w:val="lowerRoman"/>
+      <w:lvlText w:val="%6."/>
+      <w:lvlJc w:val="right"/>
+      <w:pPr>
+        <w:ind w:left="4320" w:hanging="180"/>
+      </w:pPr>
+    </w:lvl>
+    <w:lvl w:ilvl="6" w:tplc="0409000F" w:tentative="1">
+      <w:start w:val="1"/>
+      <w:numFmt w:val="decimal"/>
+      <w:lvlText w:val="%7."/>
+      <w:lvlJc w:val="left"/>
+      <w:pPr>
+        <w:ind w:left="5040" w:hanging="360"/>
+      </w:pPr>
+    </w:lvl>
+    <w:lvl w:ilvl="7" w:tplc="04090019" w:tentative="1">
+      <w:start w:val="1"/>
+      <w:numFmt w:val="lowerLetter"/>
+      <w:lvlText w:val="%8."/>
+      <w:lvlJc w:val="left"/>
+      <w:pPr>
+        <w:ind w:left="5760" w:hanging="360"/>
+      </w:pPr>
+    </w:lvl>
+    <w:lvl w:ilvl="8" w:tplc="0409001B" w:tentative="1">
+      <w:start w:val="1"/>
+      <w:numFmt w:val="lowerRoman"/>
+      <w:lvlText w:val="%9."/>
+      <w:lvlJc w:val="right"/>
+      <w:pPr>
+        <w:ind w:left="6480" w:hanging="180"/>
+      </w:pPr>
+    </w:lvl>
+  </w:abstractNum>
+  <w:num w:numId="1" w16cid:durableId="1346244209">
+    <w:abstractNumId w:val="0"/>
+  </w:num>
+</w:numbering>
 </file>
 
 <file path=word/styles.xml><?xml version="1.0" encoding="utf-8"?>
@@ -1020,6 +1646,73 @@
       <w:spacing w:val="5"/>
     </w:rPr>
   </w:style>
+  <w:style w:type="paragraph" w:styleId="Header">
+    <w:name w:val="header"/>
+    <w:basedOn w:val="Normal"/>
+    <w:link w:val="HeaderChar"/>
+    <w:uiPriority w:val="99"/>
+    <w:unhideWhenUsed/>
+    <w:rsid w:val="00DE6C8E"/>
+    <w:pPr>
+      <w:tabs>
+        <w:tab w:val="center" w:pos="4680"/>
+        <w:tab w:val="right" w:pos="9360"/>
+      </w:tabs>
+      <w:spacing w:line="240" w:lineRule="auto"/>
+    </w:pPr>
+  </w:style>
+  <w:style w:type="character" w:customStyle="1" w:styleId="HeaderChar">
+    <w:name w:val="Header Char"/>
+    <w:basedOn w:val="DefaultParagraphFont"/>
+    <w:link w:val="Header"/>
+    <w:uiPriority w:val="99"/>
+    <w:rsid w:val="00DE6C8E"/>
+  </w:style>
+  <w:style w:type="paragraph" w:styleId="Footer">
+    <w:name w:val="footer"/>
+    <w:basedOn w:val="Normal"/>
+    <w:link w:val="FooterChar"/>
+    <w:uiPriority w:val="99"/>
+    <w:unhideWhenUsed/>
+    <w:rsid w:val="00DE6C8E"/>
+    <w:pPr>
+      <w:tabs>
+        <w:tab w:val="center" w:pos="4680"/>
+        <w:tab w:val="right" w:pos="9360"/>
+      </w:tabs>
+      <w:spacing w:line="240" w:lineRule="auto"/>
+    </w:pPr>
+  </w:style>
+  <w:style w:type="character" w:customStyle="1" w:styleId="FooterChar">
+    <w:name w:val="Footer Char"/>
+    <w:basedOn w:val="DefaultParagraphFont"/>
+    <w:link w:val="Footer"/>
+    <w:uiPriority w:val="99"/>
+    <w:rsid w:val="00DE6C8E"/>
+  </w:style>
+  <w:style w:type="character" w:styleId="Hyperlink">
+    <w:name w:val="Hyperlink"/>
+    <w:basedOn w:val="DefaultParagraphFont"/>
+    <w:uiPriority w:val="99"/>
+    <w:unhideWhenUsed/>
+    <w:rsid w:val="005E6B35"/>
+    <w:rPr>
+      <w:color w:val="467886" w:themeColor="hyperlink"/>
+      <w:u w:val="single"/>
+    </w:rPr>
+  </w:style>
+  <w:style w:type="character" w:styleId="UnresolvedMention">
+    <w:name w:val="Unresolved Mention"/>
+    <w:basedOn w:val="DefaultParagraphFont"/>
+    <w:uiPriority w:val="99"/>
+    <w:semiHidden/>
+    <w:unhideWhenUsed/>
+    <w:rsid w:val="005E6B35"/>
+    <w:rPr>
+      <w:color w:val="605E5C"/>
+      <w:shd w:val="clear" w:color="auto" w:fill="E1DFDD"/>
+    </w:rPr>
+  </w:style>
 </w:styles>
 </file>
 

</xml_diff>